<commit_message>
Correct launch-recency framing in performance report
The report described all three gel flavours as new, but only
Raspberry/Watermelon is recent at 87 days; Peach/Pear and Cranberry are
six and nine months old and serve as benchmarks. Retitles accordingly and
adds a section stating each flavour's age and role, plus a note that no gel
has launched on Shopify since June and that the newer Sparkling Drinks sell
off-platform.

Co-Authored-By: Claude Opus 5 <noreply@anthropic.com>
Claude-Session: https://claude.ai/code/session_01JK5AXzGYuWMe65NkGxqHiE
</commit_message>
<xml_diff>
--- a/analysis/TrueSeaMoss_New_Launch_Performance.docx
+++ b/analysis/TrueSeaMoss_New_Launch_Performance.docx
@@ -16,7 +16,7 @@
           <w:sz w:val="17"/>
           <w:szCs w:val="17"/>
         </w:rPr>
-        <w:t xml:space="preserve">TRUESEAMOSS  ·  NEW LAUNCH PERFORMANCE</w:t>
+        <w:t xml:space="preserve">TRUESEAMOSS  ·  RECENT GEL LAUNCHES</w:t>
       </w:r>
     </w:p>
     <w:p>
@@ -32,7 +32,7 @@
           <w:sz w:val="44"/>
           <w:szCs w:val="44"/>
         </w:rPr>
-        <w:t xml:space="preserve">How the three new gel flavours are trading</w:t>
+        <w:t xml:space="preserve">How the recent gel launches are trading</w:t>
       </w:r>
     </w:p>
     <w:p>
@@ -90,7 +90,7 @@
           <w:sz w:val="21"/>
           <w:szCs w:val="21"/>
         </w:rPr>
-        <w:t xml:space="preserve">Flavours: </w:t>
+        <w:t xml:space="preserve">Subject: </w:t>
       </w:r>
       <w:r>
         <w:rPr>
@@ -99,7 +99,32 @@
           <w:sz w:val="21"/>
           <w:szCs w:val="21"/>
         </w:rPr>
-        <w:t xml:space="preserve">Gel Cranberry (9 Dec 2025), Gel Peach/Pear (20 Mar 2026), Gel Raspberry/Watermelon (15 Jun 2026).</w:t>
+        <w:t xml:space="preserve">Gel Raspberry/Watermelon, launched 15 June 2026 — the only recent gel launch on Shopify.</w:t>
+      </w:r>
+    </w:p>
+    <w:p>
+      <w:pPr>
+        <w:spacing w:after="40"/>
+      </w:pPr>
+      <w:r>
+        <w:rPr>
+          <w:rFonts w:ascii="Calibri" w:cs="Calibri" w:eastAsia="Calibri" w:hAnsi="Calibri"/>
+          <w:b/>
+          <w:bCs/>
+          <w:color w:val="1B2A27"/>
+          <w:sz w:val="21"/>
+          <w:szCs w:val="21"/>
+        </w:rPr>
+        <w:t xml:space="preserve">Benchmarks: </w:t>
+      </w:r>
+      <w:r>
+        <w:rPr>
+          <w:rFonts w:ascii="Calibri" w:cs="Calibri" w:eastAsia="Calibri" w:hAnsi="Calibri"/>
+          <w:color w:val="1B2A27"/>
+          <w:sz w:val="21"/>
+          <w:szCs w:val="21"/>
+        </w:rPr>
+        <w:t xml:space="preserve">Gel Peach/Pear (20 Mar 2026) and Gel Cranberry (9 Dec 2025), the two previous gel launches.</w:t>
       </w:r>
     </w:p>
     <w:p>
@@ -125,6 +150,652 @@
           <w:szCs w:val="21"/>
         </w:rPr>
         <w:t xml:space="preserve">daton-project · sku_cohort_base.</w:t>
+      </w:r>
+    </w:p>
+    <w:p>
+      <w:pPr>
+        <w:pStyle w:val="Heading1"/>
+        <w:spacing w:after="160" w:before="360"/>
+      </w:pPr>
+      <w:r>
+        <w:rPr>
+          <w:rFonts w:ascii="Georgia" w:cs="Georgia" w:eastAsia="Georgia" w:hAnsi="Georgia"/>
+          <w:b/>
+          <w:bCs/>
+          <w:color w:val="1F4E45"/>
+          <w:sz w:val="30"/>
+          <w:szCs w:val="30"/>
+        </w:rPr>
+        <w:t xml:space="preserve">Which launches this covers</w:t>
+      </w:r>
+    </w:p>
+    <w:p>
+      <w:pPr>
+        <w:spacing w:after="160" w:line="276"/>
+      </w:pPr>
+      <w:r>
+        <w:rPr>
+          <w:rFonts w:ascii="Calibri" w:cs="Calibri" w:eastAsia="Calibri" w:hAnsi="Calibri"/>
+          <w:color w:val="1B2A27"/>
+          <w:sz w:val="21"/>
+          <w:szCs w:val="21"/>
+        </w:rPr>
+        <w:t xml:space="preserve">Only one of these three flavours is genuinely new. Raspberry/Watermelon is 87 days old at the time of writing. Peach/Pear is approaching six months and Cranberry is nine months old — both are established products rather than launches, and they appear here because a single launch cannot be judged in isolation. They provide the comparison that makes Raspberry/Watermelon's numbers meaningful.</w:t>
+      </w:r>
+    </w:p>
+    <w:tbl>
+      <w:tblPr>
+        <w:tblW w:type="dxa" w:w="9360"/>
+        <w:tblBorders>
+          <w:top w:val="single" w:color="C9D4D1" w:sz="2"/>
+          <w:left w:val="none"/>
+          <w:bottom w:val="single" w:color="C9D4D1" w:sz="2"/>
+          <w:right w:val="none"/>
+          <w:insideH w:val="single" w:color="C9D4D1" w:sz="2"/>
+          <w:insideV w:val="none"/>
+        </w:tblBorders>
+      </w:tblPr>
+      <w:tblGrid>
+        <w:gridCol w:w="2600"/>
+        <w:gridCol w:w="1800"/>
+        <w:gridCol w:w="1300"/>
+        <w:gridCol w:w="2000"/>
+        <w:gridCol w:w="1660"/>
+      </w:tblGrid>
+      <w:tr>
+        <w:trPr>
+          <w:tblHeader/>
+        </w:trPr>
+        <w:tc>
+          <w:tcPr>
+            <w:tcW w:type="dxa" w:w="2600"/>
+            <w:shd w:fill="1F4E45" w:color="auto" w:val="clear"/>
+            <w:tcMar>
+              <w:top w:type="dxa" w:w="90"/>
+              <w:left w:type="dxa" w:w="120"/>
+              <w:bottom w:type="dxa" w:w="90"/>
+              <w:right w:type="dxa" w:w="120"/>
+            </w:tcMar>
+          </w:tcPr>
+          <w:p>
+            <w:pPr>
+              <w:spacing w:after="0"/>
+              <w:jc w:val="left"/>
+            </w:pPr>
+            <w:r>
+              <w:rPr>
+                <w:rFonts w:ascii="Calibri" w:cs="Calibri" w:eastAsia="Calibri" w:hAnsi="Calibri"/>
+                <w:b/>
+                <w:bCs/>
+                <w:color w:val="FFFFFF"/>
+                <w:sz w:val="19"/>
+                <w:szCs w:val="19"/>
+              </w:rPr>
+              <w:t xml:space="preserve">Flavour</w:t>
+            </w:r>
+          </w:p>
+        </w:tc>
+        <w:tc>
+          <w:tcPr>
+            <w:tcW w:type="dxa" w:w="1800"/>
+            <w:shd w:fill="1F4E45" w:color="auto" w:val="clear"/>
+            <w:tcMar>
+              <w:top w:type="dxa" w:w="90"/>
+              <w:left w:type="dxa" w:w="120"/>
+              <w:bottom w:type="dxa" w:w="90"/>
+              <w:right w:type="dxa" w:w="120"/>
+            </w:tcMar>
+          </w:tcPr>
+          <w:p>
+            <w:pPr>
+              <w:spacing w:after="0"/>
+              <w:jc w:val="right"/>
+            </w:pPr>
+            <w:r>
+              <w:rPr>
+                <w:rFonts w:ascii="Calibri" w:cs="Calibri" w:eastAsia="Calibri" w:hAnsi="Calibri"/>
+                <w:b/>
+                <w:bCs/>
+                <w:color w:val="FFFFFF"/>
+                <w:sz w:val="19"/>
+                <w:szCs w:val="19"/>
+              </w:rPr>
+              <w:t xml:space="preserve">Launched</w:t>
+            </w:r>
+          </w:p>
+        </w:tc>
+        <w:tc>
+          <w:tcPr>
+            <w:tcW w:type="dxa" w:w="1300"/>
+            <w:shd w:fill="1F4E45" w:color="auto" w:val="clear"/>
+            <w:tcMar>
+              <w:top w:type="dxa" w:w="90"/>
+              <w:left w:type="dxa" w:w="120"/>
+              <w:bottom w:type="dxa" w:w="90"/>
+              <w:right w:type="dxa" w:w="120"/>
+            </w:tcMar>
+          </w:tcPr>
+          <w:p>
+            <w:pPr>
+              <w:spacing w:after="0"/>
+              <w:jc w:val="right"/>
+            </w:pPr>
+            <w:r>
+              <w:rPr>
+                <w:rFonts w:ascii="Calibri" w:cs="Calibri" w:eastAsia="Calibri" w:hAnsi="Calibri"/>
+                <w:b/>
+                <w:bCs/>
+                <w:color w:val="FFFFFF"/>
+                <w:sz w:val="19"/>
+                <w:szCs w:val="19"/>
+              </w:rPr>
+              <w:t xml:space="preserve">Age</w:t>
+            </w:r>
+          </w:p>
+        </w:tc>
+        <w:tc>
+          <w:tcPr>
+            <w:tcW w:type="dxa" w:w="2000"/>
+            <w:shd w:fill="1F4E45" w:color="auto" w:val="clear"/>
+            <w:tcMar>
+              <w:top w:type="dxa" w:w="90"/>
+              <w:left w:type="dxa" w:w="120"/>
+              <w:bottom w:type="dxa" w:w="90"/>
+              <w:right w:type="dxa" w:w="120"/>
+            </w:tcMar>
+          </w:tcPr>
+          <w:p>
+            <w:pPr>
+              <w:spacing w:after="0"/>
+              <w:jc w:val="right"/>
+            </w:pPr>
+            <w:r>
+              <w:rPr>
+                <w:rFonts w:ascii="Calibri" w:cs="Calibri" w:eastAsia="Calibri" w:hAnsi="Calibri"/>
+                <w:b/>
+                <w:bCs/>
+                <w:color w:val="FFFFFF"/>
+                <w:sz w:val="19"/>
+                <w:szCs w:val="19"/>
+              </w:rPr>
+              <w:t xml:space="preserve">Role in this report</w:t>
+            </w:r>
+          </w:p>
+        </w:tc>
+        <w:tc>
+          <w:tcPr>
+            <w:tcW w:type="dxa" w:w="1660"/>
+            <w:shd w:fill="1F4E45" w:color="auto" w:val="clear"/>
+            <w:tcMar>
+              <w:top w:type="dxa" w:w="90"/>
+              <w:left w:type="dxa" w:w="120"/>
+              <w:bottom w:type="dxa" w:w="90"/>
+              <w:right w:type="dxa" w:w="120"/>
+            </w:tcMar>
+          </w:tcPr>
+          <w:p>
+            <w:pPr>
+              <w:spacing w:after="0"/>
+              <w:jc w:val="right"/>
+            </w:pPr>
+            <w:r>
+              <w:rPr>
+                <w:rFonts w:ascii="Calibri" w:cs="Calibri" w:eastAsia="Calibri" w:hAnsi="Calibri"/>
+                <w:b/>
+                <w:bCs/>
+                <w:color w:val="FFFFFF"/>
+                <w:sz w:val="19"/>
+                <w:szCs w:val="19"/>
+              </w:rPr>
+              <w:t xml:space="preserve">Gross to date</w:t>
+            </w:r>
+          </w:p>
+        </w:tc>
+      </w:tr>
+      <w:tr>
+        <w:tc>
+          <w:tcPr>
+            <w:tcW w:type="dxa" w:w="2600"/>
+            <w:tcMar>
+              <w:top w:type="dxa" w:w="90"/>
+              <w:left w:type="dxa" w:w="120"/>
+              <w:bottom w:type="dxa" w:w="90"/>
+              <w:right w:type="dxa" w:w="120"/>
+            </w:tcMar>
+          </w:tcPr>
+          <w:p>
+            <w:pPr>
+              <w:spacing w:after="0"/>
+              <w:jc w:val="left"/>
+            </w:pPr>
+            <w:r>
+              <w:rPr>
+                <w:rFonts w:ascii="Calibri" w:cs="Calibri" w:eastAsia="Calibri" w:hAnsi="Calibri"/>
+                <w:b/>
+                <w:bCs/>
+                <w:color w:val="1B2A27"/>
+                <w:sz w:val="19"/>
+                <w:szCs w:val="19"/>
+              </w:rPr>
+              <w:t xml:space="preserve">Raspberry/Watermelon</w:t>
+            </w:r>
+          </w:p>
+        </w:tc>
+        <w:tc>
+          <w:tcPr>
+            <w:tcW w:type="dxa" w:w="1800"/>
+            <w:tcMar>
+              <w:top w:type="dxa" w:w="90"/>
+              <w:left w:type="dxa" w:w="120"/>
+              <w:bottom w:type="dxa" w:w="90"/>
+              <w:right w:type="dxa" w:w="120"/>
+            </w:tcMar>
+          </w:tcPr>
+          <w:p>
+            <w:pPr>
+              <w:spacing w:after="0"/>
+              <w:jc w:val="right"/>
+            </w:pPr>
+            <w:r>
+              <w:rPr>
+                <w:rFonts w:ascii="Calibri" w:cs="Calibri" w:eastAsia="Calibri" w:hAnsi="Calibri"/>
+                <w:b w:val="false"/>
+                <w:bCs w:val="false"/>
+                <w:color w:val="1B2A27"/>
+                <w:sz w:val="19"/>
+                <w:szCs w:val="19"/>
+              </w:rPr>
+              <w:t xml:space="preserve">15 Jun 2026</w:t>
+            </w:r>
+          </w:p>
+        </w:tc>
+        <w:tc>
+          <w:tcPr>
+            <w:tcW w:type="dxa" w:w="1300"/>
+            <w:tcMar>
+              <w:top w:type="dxa" w:w="90"/>
+              <w:left w:type="dxa" w:w="120"/>
+              <w:bottom w:type="dxa" w:w="90"/>
+              <w:right w:type="dxa" w:w="120"/>
+            </w:tcMar>
+          </w:tcPr>
+          <w:p>
+            <w:pPr>
+              <w:spacing w:after="0"/>
+              <w:jc w:val="right"/>
+            </w:pPr>
+            <w:r>
+              <w:rPr>
+                <w:rFonts w:ascii="Calibri" w:cs="Calibri" w:eastAsia="Calibri" w:hAnsi="Calibri"/>
+                <w:b w:val="false"/>
+                <w:bCs w:val="false"/>
+                <w:color w:val="1B2A27"/>
+                <w:sz w:val="19"/>
+                <w:szCs w:val="19"/>
+              </w:rPr>
+              <w:t xml:space="preserve">87 days</w:t>
+            </w:r>
+          </w:p>
+        </w:tc>
+        <w:tc>
+          <w:tcPr>
+            <w:tcW w:type="dxa" w:w="2000"/>
+            <w:tcMar>
+              <w:top w:type="dxa" w:w="90"/>
+              <w:left w:type="dxa" w:w="120"/>
+              <w:bottom w:type="dxa" w:w="90"/>
+              <w:right w:type="dxa" w:w="120"/>
+            </w:tcMar>
+          </w:tcPr>
+          <w:p>
+            <w:pPr>
+              <w:spacing w:after="0"/>
+              <w:jc w:val="right"/>
+            </w:pPr>
+            <w:r>
+              <w:rPr>
+                <w:rFonts w:ascii="Calibri" w:cs="Calibri" w:eastAsia="Calibri" w:hAnsi="Calibri"/>
+                <w:b w:val="false"/>
+                <w:bCs w:val="false"/>
+                <w:color w:val="1B2A27"/>
+                <w:sz w:val="19"/>
+                <w:szCs w:val="19"/>
+              </w:rPr>
+              <w:t xml:space="preserve">Subject</w:t>
+            </w:r>
+          </w:p>
+        </w:tc>
+        <w:tc>
+          <w:tcPr>
+            <w:tcW w:type="dxa" w:w="1660"/>
+            <w:tcMar>
+              <w:top w:type="dxa" w:w="90"/>
+              <w:left w:type="dxa" w:w="120"/>
+              <w:bottom w:type="dxa" w:w="90"/>
+              <w:right w:type="dxa" w:w="120"/>
+            </w:tcMar>
+          </w:tcPr>
+          <w:p>
+            <w:pPr>
+              <w:spacing w:after="0"/>
+              <w:jc w:val="right"/>
+            </w:pPr>
+            <w:r>
+              <w:rPr>
+                <w:rFonts w:ascii="Calibri" w:cs="Calibri" w:eastAsia="Calibri" w:hAnsi="Calibri"/>
+                <w:b w:val="false"/>
+                <w:bCs w:val="false"/>
+                <w:color w:val="1B2A27"/>
+                <w:sz w:val="19"/>
+                <w:szCs w:val="19"/>
+              </w:rPr>
+              <w:t xml:space="preserve">$1,110,054</w:t>
+            </w:r>
+          </w:p>
+        </w:tc>
+      </w:tr>
+      <w:tr>
+        <w:tc>
+          <w:tcPr>
+            <w:tcW w:type="dxa" w:w="2600"/>
+            <w:shd w:fill="EFF3F2" w:color="auto" w:val="clear"/>
+            <w:tcMar>
+              <w:top w:type="dxa" w:w="90"/>
+              <w:left w:type="dxa" w:w="120"/>
+              <w:bottom w:type="dxa" w:w="90"/>
+              <w:right w:type="dxa" w:w="120"/>
+            </w:tcMar>
+          </w:tcPr>
+          <w:p>
+            <w:pPr>
+              <w:spacing w:after="0"/>
+              <w:jc w:val="left"/>
+            </w:pPr>
+            <w:r>
+              <w:rPr>
+                <w:rFonts w:ascii="Calibri" w:cs="Calibri" w:eastAsia="Calibri" w:hAnsi="Calibri"/>
+                <w:b/>
+                <w:bCs/>
+                <w:color w:val="1B2A27"/>
+                <w:sz w:val="19"/>
+                <w:szCs w:val="19"/>
+              </w:rPr>
+              <w:t xml:space="preserve">Peach/Pear</w:t>
+            </w:r>
+          </w:p>
+        </w:tc>
+        <w:tc>
+          <w:tcPr>
+            <w:tcW w:type="dxa" w:w="1800"/>
+            <w:shd w:fill="EFF3F2" w:color="auto" w:val="clear"/>
+            <w:tcMar>
+              <w:top w:type="dxa" w:w="90"/>
+              <w:left w:type="dxa" w:w="120"/>
+              <w:bottom w:type="dxa" w:w="90"/>
+              <w:right w:type="dxa" w:w="120"/>
+            </w:tcMar>
+          </w:tcPr>
+          <w:p>
+            <w:pPr>
+              <w:spacing w:after="0"/>
+              <w:jc w:val="right"/>
+            </w:pPr>
+            <w:r>
+              <w:rPr>
+                <w:rFonts w:ascii="Calibri" w:cs="Calibri" w:eastAsia="Calibri" w:hAnsi="Calibri"/>
+                <w:b w:val="false"/>
+                <w:bCs w:val="false"/>
+                <w:color w:val="1B2A27"/>
+                <w:sz w:val="19"/>
+                <w:szCs w:val="19"/>
+              </w:rPr>
+              <w:t xml:space="preserve">20 Mar 2026</w:t>
+            </w:r>
+          </w:p>
+        </w:tc>
+        <w:tc>
+          <w:tcPr>
+            <w:tcW w:type="dxa" w:w="1300"/>
+            <w:shd w:fill="EFF3F2" w:color="auto" w:val="clear"/>
+            <w:tcMar>
+              <w:top w:type="dxa" w:w="90"/>
+              <w:left w:type="dxa" w:w="120"/>
+              <w:bottom w:type="dxa" w:w="90"/>
+              <w:right w:type="dxa" w:w="120"/>
+            </w:tcMar>
+          </w:tcPr>
+          <w:p>
+            <w:pPr>
+              <w:spacing w:after="0"/>
+              <w:jc w:val="right"/>
+            </w:pPr>
+            <w:r>
+              <w:rPr>
+                <w:rFonts w:ascii="Calibri" w:cs="Calibri" w:eastAsia="Calibri" w:hAnsi="Calibri"/>
+                <w:b w:val="false"/>
+                <w:bCs w:val="false"/>
+                <w:color w:val="1B2A27"/>
+                <w:sz w:val="19"/>
+                <w:szCs w:val="19"/>
+              </w:rPr>
+              <w:t xml:space="preserve">174 days</w:t>
+            </w:r>
+          </w:p>
+        </w:tc>
+        <w:tc>
+          <w:tcPr>
+            <w:tcW w:type="dxa" w:w="2000"/>
+            <w:shd w:fill="EFF3F2" w:color="auto" w:val="clear"/>
+            <w:tcMar>
+              <w:top w:type="dxa" w:w="90"/>
+              <w:left w:type="dxa" w:w="120"/>
+              <w:bottom w:type="dxa" w:w="90"/>
+              <w:right w:type="dxa" w:w="120"/>
+            </w:tcMar>
+          </w:tcPr>
+          <w:p>
+            <w:pPr>
+              <w:spacing w:after="0"/>
+              <w:jc w:val="right"/>
+            </w:pPr>
+            <w:r>
+              <w:rPr>
+                <w:rFonts w:ascii="Calibri" w:cs="Calibri" w:eastAsia="Calibri" w:hAnsi="Calibri"/>
+                <w:b w:val="false"/>
+                <w:bCs w:val="false"/>
+                <w:color w:val="1B2A27"/>
+                <w:sz w:val="19"/>
+                <w:szCs w:val="19"/>
+              </w:rPr>
+              <w:t xml:space="preserve">Benchmark</w:t>
+            </w:r>
+          </w:p>
+        </w:tc>
+        <w:tc>
+          <w:tcPr>
+            <w:tcW w:type="dxa" w:w="1660"/>
+            <w:shd w:fill="EFF3F2" w:color="auto" w:val="clear"/>
+            <w:tcMar>
+              <w:top w:type="dxa" w:w="90"/>
+              <w:left w:type="dxa" w:w="120"/>
+              <w:bottom w:type="dxa" w:w="90"/>
+              <w:right w:type="dxa" w:w="120"/>
+            </w:tcMar>
+          </w:tcPr>
+          <w:p>
+            <w:pPr>
+              <w:spacing w:after="0"/>
+              <w:jc w:val="right"/>
+            </w:pPr>
+            <w:r>
+              <w:rPr>
+                <w:rFonts w:ascii="Calibri" w:cs="Calibri" w:eastAsia="Calibri" w:hAnsi="Calibri"/>
+                <w:b w:val="false"/>
+                <w:bCs w:val="false"/>
+                <w:color w:val="1B2A27"/>
+                <w:sz w:val="19"/>
+                <w:szCs w:val="19"/>
+              </w:rPr>
+              <w:t xml:space="preserve">$1,650,115</w:t>
+            </w:r>
+          </w:p>
+        </w:tc>
+      </w:tr>
+      <w:tr>
+        <w:tc>
+          <w:tcPr>
+            <w:tcW w:type="dxa" w:w="2600"/>
+            <w:tcMar>
+              <w:top w:type="dxa" w:w="90"/>
+              <w:left w:type="dxa" w:w="120"/>
+              <w:bottom w:type="dxa" w:w="90"/>
+              <w:right w:type="dxa" w:w="120"/>
+            </w:tcMar>
+          </w:tcPr>
+          <w:p>
+            <w:pPr>
+              <w:spacing w:after="0"/>
+              <w:jc w:val="left"/>
+            </w:pPr>
+            <w:r>
+              <w:rPr>
+                <w:rFonts w:ascii="Calibri" w:cs="Calibri" w:eastAsia="Calibri" w:hAnsi="Calibri"/>
+                <w:b/>
+                <w:bCs/>
+                <w:color w:val="1B2A27"/>
+                <w:sz w:val="19"/>
+                <w:szCs w:val="19"/>
+              </w:rPr>
+              <w:t xml:space="preserve">Cranberry</w:t>
+            </w:r>
+          </w:p>
+        </w:tc>
+        <w:tc>
+          <w:tcPr>
+            <w:tcW w:type="dxa" w:w="1800"/>
+            <w:tcMar>
+              <w:top w:type="dxa" w:w="90"/>
+              <w:left w:type="dxa" w:w="120"/>
+              <w:bottom w:type="dxa" w:w="90"/>
+              <w:right w:type="dxa" w:w="120"/>
+            </w:tcMar>
+          </w:tcPr>
+          <w:p>
+            <w:pPr>
+              <w:spacing w:after="0"/>
+              <w:jc w:val="right"/>
+            </w:pPr>
+            <w:r>
+              <w:rPr>
+                <w:rFonts w:ascii="Calibri" w:cs="Calibri" w:eastAsia="Calibri" w:hAnsi="Calibri"/>
+                <w:b w:val="false"/>
+                <w:bCs w:val="false"/>
+                <w:color w:val="1B2A27"/>
+                <w:sz w:val="19"/>
+                <w:szCs w:val="19"/>
+              </w:rPr>
+              <w:t xml:space="preserve">9 Dec 2025</w:t>
+            </w:r>
+          </w:p>
+        </w:tc>
+        <w:tc>
+          <w:tcPr>
+            <w:tcW w:type="dxa" w:w="1300"/>
+            <w:tcMar>
+              <w:top w:type="dxa" w:w="90"/>
+              <w:left w:type="dxa" w:w="120"/>
+              <w:bottom w:type="dxa" w:w="90"/>
+              <w:right w:type="dxa" w:w="120"/>
+            </w:tcMar>
+          </w:tcPr>
+          <w:p>
+            <w:pPr>
+              <w:spacing w:after="0"/>
+              <w:jc w:val="right"/>
+            </w:pPr>
+            <w:r>
+              <w:rPr>
+                <w:rFonts w:ascii="Calibri" w:cs="Calibri" w:eastAsia="Calibri" w:hAnsi="Calibri"/>
+                <w:b w:val="false"/>
+                <w:bCs w:val="false"/>
+                <w:color w:val="1B2A27"/>
+                <w:sz w:val="19"/>
+                <w:szCs w:val="19"/>
+              </w:rPr>
+              <w:t xml:space="preserve">275 days</w:t>
+            </w:r>
+          </w:p>
+        </w:tc>
+        <w:tc>
+          <w:tcPr>
+            <w:tcW w:type="dxa" w:w="2000"/>
+            <w:tcMar>
+              <w:top w:type="dxa" w:w="90"/>
+              <w:left w:type="dxa" w:w="120"/>
+              <w:bottom w:type="dxa" w:w="90"/>
+              <w:right w:type="dxa" w:w="120"/>
+            </w:tcMar>
+          </w:tcPr>
+          <w:p>
+            <w:pPr>
+              <w:spacing w:after="0"/>
+              <w:jc w:val="right"/>
+            </w:pPr>
+            <w:r>
+              <w:rPr>
+                <w:rFonts w:ascii="Calibri" w:cs="Calibri" w:eastAsia="Calibri" w:hAnsi="Calibri"/>
+                <w:b w:val="false"/>
+                <w:bCs w:val="false"/>
+                <w:color w:val="1B2A27"/>
+                <w:sz w:val="19"/>
+                <w:szCs w:val="19"/>
+              </w:rPr>
+              <w:t xml:space="preserve">Benchmark</w:t>
+            </w:r>
+          </w:p>
+        </w:tc>
+        <w:tc>
+          <w:tcPr>
+            <w:tcW w:type="dxa" w:w="1660"/>
+            <w:tcMar>
+              <w:top w:type="dxa" w:w="90"/>
+              <w:left w:type="dxa" w:w="120"/>
+              <w:bottom w:type="dxa" w:w="90"/>
+              <w:right w:type="dxa" w:w="120"/>
+            </w:tcMar>
+          </w:tcPr>
+          <w:p>
+            <w:pPr>
+              <w:spacing w:after="0"/>
+              <w:jc w:val="right"/>
+            </w:pPr>
+            <w:r>
+              <w:rPr>
+                <w:rFonts w:ascii="Calibri" w:cs="Calibri" w:eastAsia="Calibri" w:hAnsi="Calibri"/>
+                <w:b w:val="false"/>
+                <w:bCs w:val="false"/>
+                <w:color w:val="1B2A27"/>
+                <w:sz w:val="19"/>
+                <w:szCs w:val="19"/>
+              </w:rPr>
+              <w:t xml:space="preserve">$481,856</w:t>
+            </w:r>
+          </w:p>
+        </w:tc>
+      </w:tr>
+    </w:tbl>
+    <w:p>
+      <w:pPr>
+        <w:spacing w:after="160" w:line="276"/>
+      </w:pPr>
+      <w:r>
+        <w:rPr>
+          <w:rFonts w:ascii="Calibri" w:cs="Calibri" w:eastAsia="Calibri" w:hAnsi="Calibri"/>
+          <w:color w:val="1B2A27"/>
+          <w:sz w:val="21"/>
+          <w:szCs w:val="21"/>
+        </w:rPr>
+        <w:t xml:space="preserve">No gel flavour has launched on Shopify since 15 June 2026. The only other Shopify first-sales in the past twelve months are immaterial — a Gift Bergamot at $335 and a Gummies Ashwagandha at $3,605. The genuinely newest products in the business are the Sparkling Drink flavours launched 14–15 August 2026, but those sell on TikTok and Amazon only and have no Shopify presence, so they fall outside this report's scope.</w:t>
       </w:r>
     </w:p>
     <w:p>
@@ -7485,6 +8156,25 @@
           <w:szCs w:val="21"/>
         </w:rPr>
         <w:t xml:space="preserve">Launch dates are derived from first observed sale; TrueSeaMoss keeps no launch calendar.</w:t>
+      </w:r>
+    </w:p>
+    <w:p>
+      <w:pPr>
+        <w:pStyle w:val="ListParagraph"/>
+        <w:numPr>
+          <w:ilvl w:val="0"/>
+          <w:numId w:val="2"/>
+        </w:numPr>
+        <w:spacing w:after="100"/>
+      </w:pPr>
+      <w:r>
+        <w:rPr>
+          <w:rFonts w:ascii="Calibri" w:cs="Calibri" w:eastAsia="Calibri" w:hAnsi="Calibri"/>
+          <w:color w:val="1B2A27"/>
+          <w:sz w:val="21"/>
+          <w:szCs w:val="21"/>
+        </w:rPr>
+        <w:t xml:space="preserve">Cranberry's figures begin in December 2025 and Peach/Pear's in March 2026 because those are their launch months. Only Raspberry/Watermelon is a recent launch; the other two are included as benchmarks.</w:t>
       </w:r>
     </w:p>
     <w:p>

</xml_diff>